<commit_message>
docs: finalize judge-facing technical report
</commit_message>
<xml_diff>
--- a/ASTRA_report_software_branch.docx
+++ b/ASTRA_report_software_branch.docx
@@ -19029,6 +19029,9 @@
       <w:r>
         <w:t>评审方可在仓库 outputs/engineering_demo/femto_ims_to_comsol_v5/ 查看可离线打开的 index.html 和 DASHBOARD_DATA.json；启动说明见 docs/engineering_demo.md，脚本入口为 scripts/run_engineering_demo.py 与 scripts/run_engineering_demo.ps1。该模块对应赛事“寿命状态直观表达和工程应用流程”要求，主实验仍由 scripts/exp_cross_transfer_v3.py 及其审计输出定义。</w:t>
       </w:r>
+      <w:r>
+        <w:t xml:space="preserve"> frontend/ (Electron + React + TypeScript client); backend/ (Python inference, training, and data services);</w:t>
+      </w:r>
     </w:p>
     <w:p>
       <w:r>
@@ -20014,7 +20017,7 @@
     </w:p>
     <w:p>
       <w:r>
-        <w:t>软件分支边界。评委首先使用 main 分支复核主实验、数据协议、Docker 入口和审计结果；需要查看寿命状态回放时，再切换到同仓库的 software-demo 分支。该分支只读取已锁定的 FEMTO/IMS -&gt; COMSOL 仿真代理结果，不重新训练模型，也不修改主实验切分、标签、scaler、outer-fold、指标或结论。</w:t>
+        <w:t>软件分支边界。评委首先使用 main 分支复核主实验、数据协议、Docker 入口和审计结果；需要查看寿命状态回放时，再切换到同仓库的 software-demo 分支。该分支只读取已锁定的 FEMTO/IMS -&gt; COMSOL 仿真代理结果，不重新训练模型，也不修改主实验切分、标签、scaler、outer-fold、指标或结论。 软件支线实际目录为 frontend/（Electron + React + TypeScript 客户端）和 backend/（Python 推理、训练与数据服务）；两者均不属于 main 分支的主实验实现。</w:t>
       </w:r>
     </w:p>
     <w:p>
@@ -20564,7 +20567,7 @@
     <w:p>
       <w:pPr/>
       <w:r>
-        <w:t>软件工程演示（software-demo 分支）：scripts/run_engineering_demo.py；scripts/run_engineering_demo.ps1；docs/engineering_demo.md；outputs/engineering_demo/femto_ims_to_comsol_v5/</w:t>
+        <w:t>软件工程演示（software-demo 分支）：frontend/（Electron + React + TypeScript 客户端）；backend/（Python 推理、训练与数据服务）；scripts/run_engineering_demo.py；scripts/run_engineering_demo.ps1；docs/engineering_demo.md；outputs/engineering_demo/femto_ims_to_comsol_v5/。</w:t>
       </w:r>
     </w:p>
     <w:p>

</xml_diff>